<commit_message>
docs: update report with full application screenshots and OT security sections
</commit_message>
<xml_diff>
--- a/Report.docx
+++ b/Report.docx
@@ -431,14 +431,7 @@
         <w:jc w:val="both"/>
       </w:pPr>
       <w:r>
-        <w:rPr>
-          <w:rFonts w:ascii="Times New Roman" w:hAnsi="Times New Roman"/>
-          <w:b w:val="0"/>
-          <w:i w:val="0"/>
-          <w:color w:val="000000"/>
-          <w:sz w:val="24"/>
-        </w:rPr>
-        <w:t>The operational scope covers 15 distinct classes (Benign traffic, DoS Hulk, DoS GoldenEye, DoS slowloris, DoS Slowhttptest, DDoS, PortScan, FTP-Patator, SSH-Patator, Bot, Web Attack - Brute Force, Web Attack - XSS, Web Attack - SQL Injection, Infiltration, and Heartbleed). The solution includes automated data acquisition, end-to-end model training, full metric benchmarking, and standalone web dashboard deployment. Scope limitations: The system evaluates offline and batch network flow statistics; it does not directly intercept kernel-level raw packets or execute automated packet drop/firewall rules.</w:t>
+        <w:t>The operational scope covers 15 distinct classes (Benign traffic, DoS Hulk, DoS GoldenEye, DoS slowloris, DoS Slowhttptest, DDoS, PortScan, FTP-Patator, SSH-Patator, Bot, Web Attack - Brute Force, Web Attack - XSS, Web Attack - SQL Injection, Infiltration, and Heartbleed). The solution includes automated data acquisition, end-to-end model training, full metric benchmarking, and standalone web dashboard deployment. Scope limitations: The system evaluates offline and batch network flow statistics; it does not directly intercept kernel-level raw packets or execute automated packet drop/firewall rules. In addition to standard IT network environments, the scope extends to Operational Technology (OT) and Critical Infrastructure Cyber-Physical Systems (CPS). Physical sensor and actuator anomaly detection models were trained on the iTrust SWaT and WADI municipal water testbeds.</w:t>
       </w:r>
     </w:p>
     <w:p>
@@ -497,14 +490,7 @@
         <w:jc w:val="both"/>
       </w:pPr>
       <w:r>
-        <w:rPr>
-          <w:rFonts w:ascii="Times New Roman" w:hAnsi="Times New Roman"/>
-          <w:b w:val="0"/>
-          <w:i w:val="0"/>
-          <w:color w:val="000000"/>
-          <w:sz w:val="24"/>
-        </w:rPr>
-        <w:t>The research utilizes the official CIC-IDS2017 dataset released by the Canadian Institute for Cybersecurity at the University of New Brunswick (UNB). The full corpus comprises 2,830,743 network flow records across eight CSV files captured during a comprehensive 5-day simulation period. The dataset features 78 numeric flow variables and one target variable ('Label').</w:t>
+        <w:t>The research utilizes the official CIC-IDS2017 dataset released by the Canadian Institute for Cybersecurity at the University of New Brunswick (UNB). The full corpus comprises 2,830,743 network flow records across eight CSV files captured during a comprehensive 5-day simulation period. The dataset features 78 numeric flow variables and one target variable ('Label'). To evaluate system resilience across modern network topologies, training was augmented with the CSE-CIC-IDS2018 enterprise corpus, CIC-DDoS2019 reflection/amplification dataset, and iTrust SWaT/WADI cyber-physical water testbeds.</w:t>
       </w:r>
     </w:p>
     <w:p>
@@ -5220,6 +5206,110 @@
     </w:p>
     <w:p>
       <w:pPr>
+        <w:jc w:val="center"/>
+      </w:pPr>
+      <w:r>
+        <w:drawing>
+          <wp:inline xmlns:a="http://schemas.openxmlformats.org/drawingml/2006/main" xmlns:pic="http://schemas.openxmlformats.org/drawingml/2006/picture">
+            <wp:extent cx="5486400" cy="3048000"/>
+            <wp:docPr id="3" name="Picture 3"/>
+            <wp:cNvGraphicFramePr>
+              <a:graphicFrameLocks noChangeAspect="1"/>
+            </wp:cNvGraphicFramePr>
+            <a:graphic>
+              <a:graphicData uri="http://schemas.openxmlformats.org/drawingml/2006/picture">
+                <pic:pic>
+                  <pic:nvPicPr>
+                    <pic:cNvPr id="0" name="02_batch_cisco_topology_centered.png"/>
+                    <pic:cNvPicPr/>
+                  </pic:nvPicPr>
+                  <pic:blipFill>
+                    <a:blip r:embed="rId12"/>
+                    <a:stretch>
+                      <a:fillRect/>
+                    </a:stretch>
+                  </pic:blipFill>
+                  <pic:spPr>
+                    <a:xfrm>
+                      <a:off x="0" y="0"/>
+                      <a:ext cx="5486400" cy="3048000"/>
+                    </a:xfrm>
+                    <a:prstGeom prst="rect"/>
+                  </pic:spPr>
+                </pic:pic>
+              </a:graphicData>
+            </a:graphic>
+          </wp:inline>
+        </w:drawing>
+      </w:r>
+    </w:p>
+    <w:p>
+      <w:pPr>
+        <w:jc w:val="center"/>
+      </w:pPr>
+      <w:r>
+        <w:rPr>
+          <w:rFonts w:ascii="Times New Roman" w:hAnsi="Times New Roman"/>
+          <w:i/>
+          <w:sz w:val="20"/>
+        </w:rPr>
+        <w:t>Figure 6: Batch Intake Interface Featuring Interactive Cisco Packet Tracer Network Topology Simulation</w:t>
+      </w:r>
+    </w:p>
+    <w:p>
+      <w:pPr>
+        <w:jc w:val="center"/>
+      </w:pPr>
+      <w:r>
+        <w:drawing>
+          <wp:inline xmlns:a="http://schemas.openxmlformats.org/drawingml/2006/main" xmlns:pic="http://schemas.openxmlformats.org/drawingml/2006/picture">
+            <wp:extent cx="5486400" cy="4191000"/>
+            <wp:docPr id="4" name="Picture 4"/>
+            <wp:cNvGraphicFramePr>
+              <a:graphicFrameLocks noChangeAspect="1"/>
+            </wp:cNvGraphicFramePr>
+            <a:graphic>
+              <a:graphicData uri="http://schemas.openxmlformats.org/drawingml/2006/picture">
+                <pic:pic>
+                  <pic:nvPicPr>
+                    <pic:cNvPr id="0" name="03_model_telemetry.png"/>
+                    <pic:cNvPicPr/>
+                  </pic:nvPicPr>
+                  <pic:blipFill>
+                    <a:blip r:embed="rId13"/>
+                    <a:stretch>
+                      <a:fillRect/>
+                    </a:stretch>
+                  </pic:blipFill>
+                  <pic:spPr>
+                    <a:xfrm>
+                      <a:off x="0" y="0"/>
+                      <a:ext cx="5486400" cy="4191000"/>
+                    </a:xfrm>
+                    <a:prstGeom prst="rect"/>
+                  </pic:spPr>
+                </pic:pic>
+              </a:graphicData>
+            </a:graphic>
+          </wp:inline>
+        </w:drawing>
+      </w:r>
+    </w:p>
+    <w:p>
+      <w:pPr>
+        <w:jc w:val="center"/>
+      </w:pPr>
+      <w:r>
+        <w:rPr>
+          <w:rFonts w:ascii="Times New Roman" w:hAnsi="Times New Roman"/>
+          <w:i/>
+          <w:sz w:val="20"/>
+        </w:rPr>
+        <w:t>Figure 7: Model Telemetry Benchmark Interface with Cross-Validation Confusion Matrices</w:t>
+      </w:r>
+    </w:p>
+    <w:p>
+      <w:pPr>
         <w:keepNext/>
         <w:spacing w:before="200" w:after="60"/>
         <w:jc w:val="left"/>

</xml_diff>

<commit_message>
docs: integrate monochromatic system architecture mermaid diagram across documentation, app, and report
</commit_message>
<xml_diff>
--- a/Report.docx
+++ b/Report.docx
@@ -5310,6 +5310,58 @@
     </w:p>
     <w:p>
       <w:pPr>
+        <w:jc w:val="center"/>
+      </w:pPr>
+      <w:r>
+        <w:drawing>
+          <wp:inline xmlns:a="http://schemas.openxmlformats.org/drawingml/2006/main" xmlns:pic="http://schemas.openxmlformats.org/drawingml/2006/picture">
+            <wp:extent cx="5029200" cy="8960562"/>
+            <wp:docPr id="5" name="Picture 5"/>
+            <wp:cNvGraphicFramePr>
+              <a:graphicFrameLocks noChangeAspect="1"/>
+            </wp:cNvGraphicFramePr>
+            <a:graphic>
+              <a:graphicData uri="http://schemas.openxmlformats.org/drawingml/2006/picture">
+                <pic:pic>
+                  <pic:nvPicPr>
+                    <pic:cNvPr id="0" name="04_system_architecture.png"/>
+                    <pic:cNvPicPr/>
+                  </pic:nvPicPr>
+                  <pic:blipFill>
+                    <a:blip r:embed="rId14"/>
+                    <a:stretch>
+                      <a:fillRect/>
+                    </a:stretch>
+                  </pic:blipFill>
+                  <pic:spPr>
+                    <a:xfrm>
+                      <a:off x="0" y="0"/>
+                      <a:ext cx="5029200" cy="8960562"/>
+                    </a:xfrm>
+                    <a:prstGeom prst="rect"/>
+                  </pic:spPr>
+                </pic:pic>
+              </a:graphicData>
+            </a:graphic>
+          </wp:inline>
+        </w:drawing>
+      </w:r>
+    </w:p>
+    <w:p>
+      <w:pPr>
+        <w:jc w:val="center"/>
+      </w:pPr>
+      <w:r>
+        <w:rPr>
+          <w:rFonts w:ascii="Times New Roman" w:hAnsi="Times New Roman"/>
+          <w:i/>
+          <w:sz w:val="20"/>
+        </w:rPr>
+        <w:t>Figure 8: Monochromatic System Architecture Specification (Ingestion, Reconstruction, Classification, MITRE ATT&amp;CK Mapping, and SOC Analyst Terminal)</w:t>
+      </w:r>
+    </w:p>
+    <w:p>
+      <w:pPr>
         <w:keepNext/>
         <w:spacing w:before="200" w:after="60"/>
         <w:jc w:val="left"/>

</xml_diff>

<commit_message>
feat: implement continuous live Wireshark 3-pane packet sniffer and analyzer
</commit_message>
<xml_diff>
--- a/Report.docx
+++ b/Report.docx
@@ -5362,6 +5362,58 @@
     </w:p>
     <w:p>
       <w:pPr>
+        <w:jc w:val="center"/>
+      </w:pPr>
+      <w:r>
+        <w:drawing>
+          <wp:inline xmlns:a="http://schemas.openxmlformats.org/drawingml/2006/main" xmlns:pic="http://schemas.openxmlformats.org/drawingml/2006/picture">
+            <wp:extent cx="5029200" cy="5029200"/>
+            <wp:docPr id="6" name="Picture 6"/>
+            <wp:cNvGraphicFramePr>
+              <a:graphicFrameLocks noChangeAspect="1"/>
+            </wp:cNvGraphicFramePr>
+            <a:graphic>
+              <a:graphicData uri="http://schemas.openxmlformats.org/drawingml/2006/picture">
+                <pic:pic>
+                  <pic:nvPicPr>
+                    <pic:cNvPr id="0" name="02_wireshark_live_capture.png"/>
+                    <pic:cNvPicPr/>
+                  </pic:nvPicPr>
+                  <pic:blipFill>
+                    <a:blip r:embed="rId15"/>
+                    <a:stretch>
+                      <a:fillRect/>
+                    </a:stretch>
+                  </pic:blipFill>
+                  <pic:spPr>
+                    <a:xfrm>
+                      <a:off x="0" y="0"/>
+                      <a:ext cx="5029200" cy="5029200"/>
+                    </a:xfrm>
+                    <a:prstGeom prst="rect"/>
+                  </pic:spPr>
+                </pic:pic>
+              </a:graphicData>
+            </a:graphic>
+          </wp:inline>
+        </w:drawing>
+      </w:r>
+    </w:p>
+    <w:p>
+      <w:pPr>
+        <w:jc w:val="center"/>
+      </w:pPr>
+      <w:r>
+        <w:rPr>
+          <w:rFonts w:ascii="Times New Roman" w:hAnsi="Times New Roman"/>
+          <w:i/>
+          <w:sz w:val="20"/>
+        </w:rPr>
+        <w:t>Figure 9: Real-Time Wireshark 3-Pane Continuous Sniffer (Frame Table, Layer Dissection, and Hex/ASCII Byte Dump)</w:t>
+      </w:r>
+    </w:p>
+    <w:p>
+      <w:pPr>
         <w:keepNext/>
         <w:spacing w:before="200" w:after="60"/>
         <w:jc w:val="left"/>

</xml_diff>

<commit_message>
feat: package and track production model files and update project report
</commit_message>
<xml_diff>
--- a/Report.docx
+++ b/Report.docx
@@ -4805,14 +4805,7 @@
         <w:spacing w:after="40"/>
       </w:pPr>
       <w:r>
-        <w:rPr>
-          <w:rFonts w:ascii="Times New Roman" w:hAnsi="Times New Roman"/>
-          <w:b w:val="0"/>
-          <w:i w:val="0"/>
-          <w:color w:val="000000"/>
-          <w:sz w:val="24"/>
-        </w:rPr>
-        <w:t>Model Serialization Module: Exports pipeline, feature names, classes, and test metrics to 'model.pkl'.</w:t>
+        <w:t>Model Serialization Module: Exports pipelines, feature matrices, target classes, and benchmark test metrics to production artifacts: 'model.pkl' (Super-Unified 25-class IT/OT ensemble, 494 MB chunked for repository distribution), 'model_swat_ot.pkl' (iTrust SWaT SCADA water treatment model), and 'model_wadi_ot.pkl' (iTrust WADI water distribution grid model).</w:t>
       </w:r>
     </w:p>
     <w:p>
@@ -5583,14 +5576,7 @@
         <w:jc w:val="both"/>
       </w:pPr>
       <w:r>
-        <w:rPr>
-          <w:rFonts w:ascii="Times New Roman" w:hAnsi="Times New Roman"/>
-          <w:b w:val="0"/>
-          <w:i w:val="0"/>
-          <w:color w:val="000000"/>
-          <w:sz w:val="24"/>
-        </w:rPr>
-        <w:t>The repository contains the complete Google Colab notebook (.ipynb), preprocessed dataset (dataset.csv), serialized best model (model.pkl), and Streamlit SOC dashboard application (app.py).</w:t>
+        <w:t>The repository contains the complete Google Colab notebook (.ipynb), preprocessed dataset specifications, serialized multi-domain production models ('model.pkl', 'model_swat_ot.pkl', 'model_wadi_ot.pkl'), and the interactive Streamlit SOC dashboard application ('app.py').</w:t>
       </w:r>
     </w:p>
     <w:p>

</xml_diff>